<commit_message>
fix(TIM): correct real-waveform beat counts, add vitaldb dep, plot detected beats, map public repo abp_zero_calibration
Co-Authored-By: Tatsuki Onishi <bougtoir@gmail.com>
</commit_message>
<xml_diff>
--- a/zero_calibration_bpm/manuscripts/TIM_ZeroFree_Manuscript_EN.docx
+++ b/zero_calibration_bpm/manuscripts/TIM_ZeroFree_Manuscript_EN.docx
@@ -126,7 +126,7 @@
           <w:rFonts w:ascii="Times New Roman" w:hAnsi="Times New Roman"/>
           <w:sz w:val="24"/>
         </w:rPr>
-        <w:t>~4329</w:t>
+        <w:t>~4337</w:t>
       </w:r>
     </w:p>
     <w:p>
@@ -328,16 +328,16 @@
             <m:t>n</m:t>
           </m:r>
           <m:r>
-            <m:t>≈</m:t>
+            <m:t>=</m:t>
           </m:r>
           <m:r>
-            <m:t>54</m:t>
+            <m:t>1</m:t>
           </m:r>
           <m:r>
             <m:t>,</m:t>
           </m:r>
           <m:r>
-            <m:t>346</m:t>
+            <m:t>874</m:t>
           </m:r>
         </m:oMath>
       </w:r>
@@ -348,7 +348,7 @@
           <w:i w:val="0"/>
           <w:sz w:val="24"/>
         </w:rPr>
-        <w:t xml:space="preserve"> beats) and applied the same four error models to the real waveforms. Each case was assessed with the minimal Bland-Altman summary (mean bias, limits of agreement), Bland-Altman difference-versus-mean regression, Deming and Passing-Bablok regression, and Lin's concordance correlation coefficient (CCC) with its scale-shift component. Synthetic arterial waveforms were passed through optimally-, under-, and over-damped second-order catheter-transducer models.</w:t>
+        <w:t xml:space="preserve"> paired beats per scenario) and applied the same four error models to the real waveforms. Each case was assessed with the minimal Bland-Altman summary (mean bias, limits of agreement), Bland-Altman difference-versus-mean regression, Deming and Passing-Bablok regression, and Lin's concordance correlation coefficient (CCC) with its scale-shift component. Synthetic arterial waveforms were passed through optimally-, under-, and over-damped second-order catheter-transducer models.</w:t>
       </w:r>
     </w:p>
     <w:p>
@@ -4308,10 +4308,16 @@
             <m:t>n</m:t>
           </m:r>
           <m:r>
-            <m:t>≈</m:t>
+            <m:t>=</m:t>
           </m:r>
           <m:r>
-            <m:t>54346</m:t>
+            <m:t>1</m:t>
+          </m:r>
+          <m:r>
+            <m:t>,</m:t>
+          </m:r>
+          <m:r>
+            <m:t>874</m:t>
           </m:r>
         </m:oMath>
       </w:r>
@@ -4322,7 +4328,7 @@
           <w:i w:val="0"/>
           <w:sz w:val="24"/>
         </w:rPr>
-        <w:t xml:space="preserve"> beats). The pattern matched the synthetic data: a compensating offset made the mean bias effectively zero (-0.0 mmHg), while the proportional-bias indicators remained elevated (CCC scale shift </w:t>
+        <w:t xml:space="preserve"> paired beats per scenario). The pattern matched the synthetic data: a compensating offset made the mean bias effectively zero (-0.0 mmHg), while the proportional-bias indicators remained elevated (CCC scale shift </w:t>
       </w:r>
       <w:r>
         <w:rPr>
@@ -4368,7 +4374,7 @@
           <w:i/>
           <w:sz w:val="24"/>
         </w:rPr>
-        <w:t>Table 3. Real-waveform method-comparison metrics from the VitalDB Open Dataset (n = 29 cases).</w:t>
+        <w:t>Table 3. Real-waveform method-comparison metrics from the VitalDB Open Dataset (29 cases; n = paired beats).</w:t>
       </w:r>
     </w:p>
     <w:tbl>

</xml_diff>

<commit_message>
fix: complete Table 3 sample size and soften range-dependence claim; regenerate submission package
Co-Authored-By: Tatsuki Onishi <bougtoir@gmail.com>
</commit_message>
<xml_diff>
--- a/zero_calibration_bpm/manuscripts/TIM_ZeroFree_Manuscript_EN.docx
+++ b/zero_calibration_bpm/manuscripts/TIM_ZeroFree_Manuscript_EN.docx
@@ -126,7 +126,7 @@
           <w:rFonts w:ascii="Times New Roman" w:hAnsi="Times New Roman"/>
           <w:sz w:val="24"/>
         </w:rPr>
-        <w:t>~4337</w:t>
+        <w:t>~4358</w:t>
       </w:r>
     </w:p>
     <w:p>
@@ -2445,6 +2445,81 @@
           <w:sz w:val="24"/>
         </w:rPr>
         <w:t xml:space="preserve"> 0.990). An uncompensated 10% gain error (S3) was obvious on every analysis, including the mean bias (+12.7 mmHg): gain error is not invisible to a Bland–Altman analysis.</w:t>
+      </w:r>
+    </w:p>
+    <w:p>
+      <w:pPr>
+        <w:jc w:val="center"/>
+      </w:pPr>
+      <w:r>
+        <w:drawing>
+          <wp:inline xmlns:a="http://schemas.openxmlformats.org/drawingml/2006/main" xmlns:pic="http://schemas.openxmlformats.org/drawingml/2006/picture">
+            <wp:extent cx="5486400" cy="4937760"/>
+            <wp:docPr id="2" name="Picture 2"/>
+            <wp:cNvGraphicFramePr>
+              <a:graphicFrameLocks noChangeAspect="1"/>
+            </wp:cNvGraphicFramePr>
+            <a:graphic>
+              <a:graphicData uri="http://schemas.openxmlformats.org/drawingml/2006/picture">
+                <pic:pic>
+                  <pic:nvPicPr>
+                    <pic:cNvPr id="0" name="figure2_scenarios_concordance.png"/>
+                    <pic:cNvPicPr/>
+                  </pic:nvPicPr>
+                  <pic:blipFill>
+                    <a:blip r:embed="rId10"/>
+                    <a:stretch>
+                      <a:fillRect/>
+                    </a:stretch>
+                  </pic:blipFill>
+                  <pic:spPr>
+                    <a:xfrm>
+                      <a:off x="0" y="0"/>
+                      <a:ext cx="5486400" cy="4937760"/>
+                    </a:xfrm>
+                    <a:prstGeom prst="rect"/>
+                  </pic:spPr>
+                </pic:pic>
+              </a:graphicData>
+            </a:graphic>
+          </wp:inline>
+        </w:drawing>
+      </w:r>
+    </w:p>
+    <w:p>
+      <w:pPr>
+        <w:spacing w:after="240"/>
+        <w:jc w:val="center"/>
+      </w:pPr>
+      <w:r>
+        <w:rPr>
+          <w:rFonts w:ascii="Times New Roman" w:hAnsi="Times New Roman"/>
+          <w:b w:val="0"/>
+          <w:i/>
+          <w:sz w:val="20"/>
+        </w:rPr>
+        <w:t xml:space="preserve">Figure 2. Device-versus-reference concordance for the four static scenarios (dashed line = identity). Each panel shows the CCC, the CCC scale shift </w:t>
+      </w:r>
+      <w:r>
+        <w:rPr>
+          <w:rFonts w:ascii="Cambria Math" w:hAnsi="Cambria Math"/>
+          <w:i/>
+          <w:sz w:val="20"/>
+        </w:rPr>
+        <m:oMath xmlns:a="http://schemas.openxmlformats.org/drawingml/2006/main" xmlns:pic="http://schemas.openxmlformats.org/drawingml/2006/picture">
+          <m:r>
+            <m:t>v</m:t>
+          </m:r>
+        </m:oMath>
+      </w:r>
+      <w:r>
+        <w:rPr>
+          <w:rFonts w:ascii="Times New Roman" w:hAnsi="Times New Roman"/>
+          <w:b w:val="0"/>
+          <w:i/>
+          <w:sz w:val="20"/>
+        </w:rPr>
+        <w:t>, and the Bland–Altman mean bias. S4 has a near-zero mean bias despite a 10% gain error.</w:t>
       </w:r>
     </w:p>
     <w:p>
@@ -3269,81 +3344,6 @@
     </w:p>
     <w:p>
       <w:pPr>
-        <w:jc w:val="center"/>
-      </w:pPr>
-      <w:r>
-        <w:drawing>
-          <wp:inline xmlns:a="http://schemas.openxmlformats.org/drawingml/2006/main" xmlns:pic="http://schemas.openxmlformats.org/drawingml/2006/picture">
-            <wp:extent cx="5486400" cy="4937760"/>
-            <wp:docPr id="2" name="Picture 2"/>
-            <wp:cNvGraphicFramePr>
-              <a:graphicFrameLocks noChangeAspect="1"/>
-            </wp:cNvGraphicFramePr>
-            <a:graphic>
-              <a:graphicData uri="http://schemas.openxmlformats.org/drawingml/2006/picture">
-                <pic:pic>
-                  <pic:nvPicPr>
-                    <pic:cNvPr id="0" name="figure2_scenarios_concordance.png"/>
-                    <pic:cNvPicPr/>
-                  </pic:nvPicPr>
-                  <pic:blipFill>
-                    <a:blip r:embed="rId10"/>
-                    <a:stretch>
-                      <a:fillRect/>
-                    </a:stretch>
-                  </pic:blipFill>
-                  <pic:spPr>
-                    <a:xfrm>
-                      <a:off x="0" y="0"/>
-                      <a:ext cx="5486400" cy="4937760"/>
-                    </a:xfrm>
-                    <a:prstGeom prst="rect"/>
-                  </pic:spPr>
-                </pic:pic>
-              </a:graphicData>
-            </a:graphic>
-          </wp:inline>
-        </w:drawing>
-      </w:r>
-    </w:p>
-    <w:p>
-      <w:pPr>
-        <w:spacing w:after="240"/>
-        <w:jc w:val="center"/>
-      </w:pPr>
-      <w:r>
-        <w:rPr>
-          <w:rFonts w:ascii="Times New Roman" w:hAnsi="Times New Roman"/>
-          <w:b w:val="0"/>
-          <w:i/>
-          <w:sz w:val="20"/>
-        </w:rPr>
-        <w:t xml:space="preserve">Figure 2. Device-versus-reference concordance for the four static scenarios (dashed line = identity). Each panel shows the CCC, the CCC scale shift </w:t>
-      </w:r>
-      <w:r>
-        <w:rPr>
-          <w:rFonts w:ascii="Cambria Math" w:hAnsi="Cambria Math"/>
-          <w:i/>
-          <w:sz w:val="20"/>
-        </w:rPr>
-        <m:oMath xmlns:a="http://schemas.openxmlformats.org/drawingml/2006/main" xmlns:pic="http://schemas.openxmlformats.org/drawingml/2006/picture">
-          <m:r>
-            <m:t>v</m:t>
-          </m:r>
-        </m:oMath>
-      </w:r>
-      <w:r>
-        <w:rPr>
-          <w:rFonts w:ascii="Times New Roman" w:hAnsi="Times New Roman"/>
-          <w:b w:val="0"/>
-          <w:i/>
-          <w:sz w:val="20"/>
-        </w:rPr>
-        <w:t>, and the Bland–Altman mean bias. S4 has a near-zero mean bias despite a 10% gain error.</w:t>
-      </w:r>
-    </w:p>
-    <w:p>
-      <w:pPr>
         <w:spacing w:after="120"/>
       </w:pPr>
       <w:r>
@@ -4052,7 +4052,7 @@
           <w:i w:val="0"/>
           <w:sz w:val="24"/>
         </w:rPr>
-        <w:t xml:space="preserve">For a single device with a fixed 5% gain error, the CCC rose from 0.60 when sampled over a narrow pressure range (20 mmHg wide) to 0.96 over a wide range (100 mmHg), while the scale shift </w:t>
+        <w:t xml:space="preserve">For a single device with a fixed 5% gain error, the CCC rose from 0.60 when sampled over a narrow pressure range (20 mmHg wide) to 0.96 over a wide range (100 mmHg). The scale shift </w:t>
       </w:r>
       <w:r>
         <w:rPr>
@@ -4072,7 +4072,7 @@
           <w:i w:val="0"/>
           <w:sz w:val="24"/>
         </w:rPr>
-        <w:t xml:space="preserve"> remained close to its true value (Fig. 6). The CCC therefore should be reported together with the sampled pressure range; the structural components (</w:t>
+        <w:t xml:space="preserve"> was far less range-dependent than CCC and approached the true gain ratio as the sampled range widened (Fig. 6). The CCC therefore should be reported together with the sampled pressure range; the structural components (</w:t>
       </w:r>
       <w:r>
         <w:rPr>
@@ -4244,7 +4244,7 @@
           <w:i/>
           <w:sz w:val="20"/>
         </w:rPr>
-        <w:t xml:space="preserve"> stays close to the true gain ratio.</w:t>
+        <w:t xml:space="preserve"> is less range-dependent and approaches the true gain ratio (dotted line) at wider ranges.</w:t>
       </w:r>
     </w:p>
     <w:p>
@@ -4374,7 +4374,7 @@
           <w:i/>
           <w:sz w:val="24"/>
         </w:rPr>
-        <w:t>Table 3. Real-waveform method-comparison metrics from the VitalDB Open Dataset (29 cases; n = paired beats).</w:t>
+        <w:t>Table 3. Real-waveform method-comparison metrics from the VitalDB Open Dataset (29 cases; n = 1,874 paired beats per scenario).</w:t>
       </w:r>
     </w:p>
     <w:tbl>

</xml_diff>

<commit_message>
Update Data availability to point to public repo bougtoir/abp_zero_calibration
Co-Authored-By: Tatsuki Onishi <bougtoir@gmail.com>
</commit_message>
<xml_diff>
--- a/zero_calibration_bpm/manuscripts/TIM_ZeroFree_Manuscript_EN.docx
+++ b/zero_calibration_bpm/manuscripts/TIM_ZeroFree_Manuscript_EN.docx
@@ -126,7 +126,7 @@
           <w:rFonts w:ascii="Times New Roman" w:hAnsi="Times New Roman"/>
           <w:sz w:val="24"/>
         </w:rPr>
-        <w:t>~4358</w:t>
+        <w:t>~4370</w:t>
       </w:r>
     </w:p>
     <w:p>
@@ -2328,7 +2328,7 @@
           <w:i w:val="0"/>
           <w:sz w:val="24"/>
         </w:rPr>
-        <w:t xml:space="preserve"> paired systolic pressures drawn uniformly over 80.0-180.0 mmHg with Gaussian measurement noise (SD = 3.0 mmHg): S1 offset only (+12.0 mmHg, gain 1.0); S2 ideal zeroing (offset removed, gain 1.0); S3 uncompensated gain error (gain 1.10); and S4 the same gain error with a compensating negative offset chosen so the mean difference is approximately zero. Dynamic scenarios passed synthetic waveforms through optimal, under-damped and over-damped systems. A range-dependence experiment sampled one fixed device (5% gain error) over pressure ranges of increasing width. The random seed, all parameters and the full pipeline (simulate -&gt; analyse -&gt; figures -&gt; manuscript) are provided in the public repository so that a third party can regenerate every number, table and figure from a clean clone.</w:t>
+        <w:t xml:space="preserve"> paired systolic pressures drawn uniformly over 80.0-180.0 mmHg with Gaussian measurement noise (SD = 3.0 mmHg): S1 offset only (+12.0 mmHg, gain 1.0); S2 ideal zeroing (offset removed, gain 1.0); S3 uncompensated gain error (gain 1.10); and S4 the same gain error with a compensating negative offset chosen so the mean difference is approximately zero. Dynamic scenarios passed synthetic waveforms through optimal, under-damped and over-damped systems. A range-dependence experiment sampled one fixed device (5% gain error) over pressure ranges of increasing width. The random seed, all parameters and the full pipeline (simulate -&gt; analyse -&gt; figures -&gt; manuscript) are available in the public repository (https://github.com/bougtoir/abp_zero_calibration) so that a third party can regenerate every number, table and figure from a clean clone.</w:t>
       </w:r>
     </w:p>
     <w:p>
@@ -6012,7 +6012,7 @@
           <w:i w:val="0"/>
           <w:sz w:val="24"/>
         </w:rPr>
-        <w:t>Replication code, parameter files, and the generated data used to produce every number, table and figure are provided as supplementary material with this submission. The real-waveform validation uses the VitalDB Open Dataset, which is publicly available at https://api.vitaldb.net/.</w:t>
+        <w:t>Replication code, parameter files, and the generated data used to produce every number, table and figure are available in the public repository https://github.com/bougtoir/abp_zero_calibration. The real-waveform validation uses the VitalDB Open Dataset, which is publicly available at https://api.vitaldb.net/.</w:t>
       </w:r>
     </w:p>
     <w:p>

</xml_diff>